<commit_message>
add OLP annotation to about page
</commit_message>
<xml_diff>
--- a/YMOブログ運用手順書.docx
+++ b/YMOブログ運用手順書.docx
@@ -469,6 +469,41 @@
         <w:t>・サイトが更新されない → git push まで完了しているか確認（1〜2分待っても変わらない場合は高橋さんへ）</w:t>
       </w:r>
     </w:p>
+    <w:p>
+      <w:pPr>
+        <w:pStyle w:val="Heading1"/>
+      </w:pPr>
+      <w:r>
+        <w:t>【重要】DNS設定の注意点</w:t>
+      </w:r>
+    </w:p>
+    <w:p>
+      <w:r>
+        <w:rPr>
+          <w:b/>
+        </w:rPr>
+        <w:t>⚠️ CNAMEの値はVercelが自動で決める固有の値です。</w:t>
+      </w:r>
+    </w:p>
+    <w:p>
+      <w:r>
+        <w:t>ムームーDNSにCNAMEを設定するとき、「cname.vercel-dns.com」という一般的な値ではなく、Vercelのプロジェクトごとに割り当てられた固有の値を使う必要があります。</w:t>
+        <w:br/>
+        <w:br/>
+        <w:t>正しい値の確認方法：</w:t>
+        <w:br/>
+        <w:t>① VercelのプロジェクトページでDomainsを開く</w:t>
+        <w:br/>
+        <w:t>② 対象ドメインの「DNS Change Recommended」をクリック</w:t>
+        <w:br/>
+        <w:t>③ 表示されたCNAMEの「Value」欄の値をそのままコピーして使う</w:t>
+        <w:br/>
+        <w:br/>
+        <w:t>例：bb6895481cdf7d82.vercel-dns-017.com.</w:t>
+        <w:br/>
+        <w:t>（この値はプロジェクトによって異なります）</w:t>
+      </w:r>
+    </w:p>
     <w:sectPr>
       <w:pgSz w:w="12240" w:h="15840"/>
       <w:pgMar w:top="1440" w:right="1800" w:bottom="1440" w:left="1800" w:header="720" w:footer="720" w:gutter="0"/>

</xml_diff>